<commit_message>
Replace report figures with supplied VS Code screenshots
</commit_message>
<xml_diff>
--- a/report.docx
+++ b/report.docx
@@ -1177,7 +1177,7 @@
           <w:sz w:val="24"/>
           <w:color w:val="000000"/>
         </w:rPr>
-        <w:t xml:space="preserve">В Main создан автомобиль. Сеттерами владелец изменён на Пётр, страховой номер — на 222, тип двигателя — на Diesel. На скриншоте показан исходный файл и фактический запуск Main.</w:t>
+        <w:t xml:space="preserve">В Main создан автомобиль. Сеттерами владелец изменён на Пётр, страховой номер — на 222, тип двигателя — на Diesel. Ниже приведён результат запуска Main; исходный код Car показан на следующей странице.</w:t>
       </w:r>
     </w:p>
     <w:p>
@@ -1196,13 +1196,13 @@
         </w:rPr>
         <w:drawing>
           <wp:inline distT="0" distB="0" distL="0" distR="0">
-            <wp:extent cx="5905500" cy="4171521"/>
-            <wp:docPr id="101" name="Рисунок 1 Скриншот проверки класса Car"/>
+            <wp:extent cx="2520000" cy="2225454"/>
+            <wp:docPr id="101" name="Рисунок 1 Результат запуска Main"/>
             <ns0:graphic xmlns:ns0="http://schemas.openxmlformats.org/drawingml/2006/main">
               <ns0:graphicData uri="http://schemas.openxmlformats.org/drawingml/2006/picture">
                 <ns1:pic xmlns:ns1="http://schemas.openxmlformats.org/drawingml/2006/picture">
                   <ns1:nvPicPr>
-                    <ns1:cNvPr id="101" name="stage1.png"/>
+                    <ns1:cNvPr id="101" name="output.png"/>
                     <ns1:cNvPicPr/>
                   </ns1:nvPicPr>
                   <ns1:blipFill>
@@ -1214,7 +1214,7 @@
                   <ns1:spPr>
                     <ns0:xfrm>
                       <ns0:off x="0" y="0"/>
-                      <ns0:ext cx="5905500" cy="4171521"/>
+                      <ns0:ext cx="2520000" cy="2225454"/>
                     </ns0:xfrm>
                     <ns0:prstGeom prst="rect">
                       <ns0:avLst/>
@@ -1240,7 +1240,7 @@
           <w:sz w:val="20"/>
           <w:color w:val="000000"/>
         </w:rPr>
-        <w:t xml:space="preserve">Рисунок 1 Скриншот проверки класса Car</w:t>
+        <w:t xml:space="preserve">Рисунок 1 Результат запуска Main</w:t>
       </w:r>
     </w:p>
     <w:p>
@@ -1275,7 +1275,7 @@
     </w:p>
     <w:p>
       <w:pPr>
-        <w:pStyle w:val="1"/>
+        <w:pStyle w:val="2"/>
         <w:ind w:firstLine="709"/>
         <w:pageBreakBefore/>
         <w:jc w:val="left"/>
@@ -1284,7 +1284,7 @@
         <w:rPr>
           <w:color w:val="000000"/>
         </w:rPr>
-        <w:t>Задача 2.2</w:t>
+        <w:t>Класс Car первой части</w:t>
       </w:r>
     </w:p>
     <w:p>
@@ -1301,28 +1301,15 @@
           <w:sz w:val="24"/>
           <w:color w:val="000000"/>
         </w:rPr>
-        <w:t xml:space="preserve">Часть 1 Задача 2</w:t>
-      </w:r>
-    </w:p>
-    <w:p>
-      <w:pPr>
-        <w:pStyle w:val="2"/>
-        <w:ind w:firstLine="709"/>
-        <w:jc w:val="left"/>
-      </w:pPr>
-      <w:r>
-        <w:rPr>
-          <w:color w:val="000000"/>
-        </w:rPr>
-        <w:t>Описание задачи, цель</w:t>
-      </w:r>
-    </w:p>
-    <w:p>
-      <w:pPr>
-        <w:pStyle w:val="a"/>
-        <w:ind w:firstLine="709"/>
-        <w:widowControl/>
-        <w:jc w:val="both"/>
+        <w:t xml:space="preserve">В Car закрытые поля ownerName и insuranceNumber читаются и изменяются через публичные методы. engineType объявлен protected, чтобы к нему мог обращаться наследник. Для поля также предусмотрены геттер и сеттер.</w:t>
+      </w:r>
+    </w:p>
+    <w:p>
+      <w:pPr>
+        <w:pStyle w:val="a"/>
+        <w:keepNext/>
+        <w:widowControl/>
+        <w:jc w:val="center"/>
         <w:spacing w:before="0" w:after="160" w:line="259" w:lineRule="auto"/>
       </w:pPr>
       <w:r>
@@ -1331,96 +1318,15 @@
           <w:sz w:val="24"/>
           <w:color w:val="000000"/>
         </w:rPr>
-        <w:t xml:space="preserve">Создайте новый класс ElectricCar, который наследует класс Car, и добавьте в него поле batteryCapacity. В классе ElectricCar используйте поле engineType, чтобы задать тип двигателя как "Electric". Проверьте работу инкапсуляции и наследования, создав объекты классов Car и ElectricCar и продемонстрируйте доступ к полям с разными модификаторами.</w:t>
-      </w:r>
-    </w:p>
-    <w:p>
-      <w:pPr>
-        <w:pStyle w:val="a"/>
-        <w:ind w:firstLine="709"/>
-        <w:widowControl/>
-        <w:jc w:val="both"/>
-        <w:spacing w:before="0" w:after="160" w:line="259" w:lineRule="auto"/>
-      </w:pPr>
-      <w:r>
-        <w:rPr>
-          <w:rFonts w:ascii="Times New Roman" w:hAnsi="Times New Roman" w:cs="Times New Roman"/>
-          <w:sz w:val="24"/>
-          <w:color w:val="000000"/>
-        </w:rPr>
-        <w:t xml:space="preserve">Цель работы — научиться наследовать класс и использовать защищённое поле в наследнике.</w:t>
-      </w:r>
-    </w:p>
-    <w:p>
-      <w:pPr>
-        <w:pStyle w:val="2"/>
-        <w:ind w:firstLine="709"/>
-        <w:jc w:val="left"/>
-      </w:pPr>
-      <w:r>
-        <w:rPr>
-          <w:color w:val="000000"/>
-        </w:rPr>
-        <w:t>Ход работы</w:t>
-      </w:r>
-    </w:p>
-    <w:p>
-      <w:pPr>
-        <w:pStyle w:val="a"/>
-        <w:ind w:firstLine="709"/>
-        <w:widowControl/>
-        <w:jc w:val="both"/>
-        <w:spacing w:before="0" w:after="160" w:line="259" w:lineRule="auto"/>
-      </w:pPr>
-      <w:r>
-        <w:rPr>
-          <w:rFonts w:ascii="Times New Roman" w:hAnsi="Times New Roman" w:cs="Times New Roman"/>
-          <w:sz w:val="24"/>
-          <w:color w:val="000000"/>
-        </w:rPr>
-        <w:t xml:space="preserve">ElectricCar наследует Car с помощью extends. В конструкторе super вызывает конструктор Car, после чего engineType получает значение Electric. Поле batteryCapacity объявлено private и имеет геттер и сеттер.</w:t>
-      </w:r>
-    </w:p>
-    <w:p>
-      <w:pPr>
-        <w:pStyle w:val="a"/>
-        <w:ind w:firstLine="709"/>
-        <w:widowControl/>
-        <w:jc w:val="both"/>
-        <w:spacing w:before="0" w:after="160" w:line="259" w:lineRule="auto"/>
-      </w:pPr>
-      <w:r>
-        <w:rPr>
-          <w:rFonts w:ascii="Times New Roman" w:hAnsi="Times New Roman" w:cs="Times New Roman"/>
-          <w:sz w:val="24"/>
-          <w:color w:val="000000"/>
-        </w:rPr>
-        <w:t xml:space="preserve">В Main создан электромобиль. Через методы изменены владелец, страховка и ёмкость аккумулятора. Поля владельца и страховки используются через унаследованные методы Car.</w:t>
-      </w:r>
-    </w:p>
-    <w:p>
-      <w:pPr>
-        <w:pStyle w:val="a"/>
-        <w:keepNext/>
-        <w:widowControl/>
-        <w:jc w:val="center"/>
-        <w:spacing w:before="0" w:after="160" w:line="259" w:lineRule="auto"/>
-      </w:pPr>
-      <w:r>
-        <w:rPr>
-          <w:rFonts w:ascii="Times New Roman" w:hAnsi="Times New Roman" w:cs="Times New Roman"/>
-          <w:sz w:val="24"/>
-          <w:color w:val="000000"/>
-        </w:rPr>
         <w:drawing>
           <wp:inline distT="0" distB="0" distL="0" distR="0">
-            <wp:extent cx="5905500" cy="4171521"/>
-            <wp:docPr id="102" name="Рисунок 2 Скриншот проверки класса ElectricCar"/>
+            <wp:extent cx="4680000" cy="6506341"/>
+            <wp:docPr id="102" name="Рисунок 2 Код Car первой части"/>
             <ns2:graphic xmlns:ns2="http://schemas.openxmlformats.org/drawingml/2006/main">
               <ns2:graphicData uri="http://schemas.openxmlformats.org/drawingml/2006/picture">
                 <ns3:pic xmlns:ns3="http://schemas.openxmlformats.org/drawingml/2006/picture">
                   <ns3:nvPicPr>
-                    <ns3:cNvPr id="102" name="stage2.png"/>
+                    <ns3:cNvPr id="102" name="car-code.png"/>
                     <ns3:cNvPicPr/>
                   </ns3:nvPicPr>
                   <ns3:blipFill>
@@ -1432,7 +1338,7 @@
                   <ns3:spPr>
                     <ns2:xfrm>
                       <ns2:off x="0" y="0"/>
-                      <ns2:ext cx="5905500" cy="4171521"/>
+                      <ns2:ext cx="4680000" cy="6506341"/>
                     </ns2:xfrm>
                     <ns2:prstGeom prst="rect">
                       <ns2:avLst/>
@@ -1458,37 +1364,7 @@
           <w:sz w:val="20"/>
           <w:color w:val="000000"/>
         </w:rPr>
-        <w:t xml:space="preserve">Рисунок 2 Скриншот проверки класса ElectricCar</w:t>
-      </w:r>
-    </w:p>
-    <w:p>
-      <w:pPr>
-        <w:pStyle w:val="2"/>
-        <w:ind w:firstLine="709"/>
-        <w:jc w:val="left"/>
-      </w:pPr>
-      <w:r>
-        <w:rPr>
-          <w:color w:val="000000"/>
-        </w:rPr>
-        <w:t>Результаты и выводы</w:t>
-      </w:r>
-    </w:p>
-    <w:p>
-      <w:pPr>
-        <w:pStyle w:val="a"/>
-        <w:ind w:firstLine="709"/>
-        <w:widowControl/>
-        <w:jc w:val="both"/>
-        <w:spacing w:before="0" w:after="160" w:line="259" w:lineRule="auto"/>
-      </w:pPr>
-      <w:r>
-        <w:rPr>
-          <w:rFonts w:ascii="Times New Roman" w:hAnsi="Times New Roman" w:cs="Times New Roman"/>
-          <w:sz w:val="24"/>
-          <w:color w:val="000000"/>
-        </w:rPr>
-        <w:t xml:space="preserve">Вывод показывает владельца Мария, страховку 444, двигатель Electric и аккумулятор 75.0 кВт·ч. Научился наследовать методы и обращаться к protected-полю внутри наследника.</w:t>
+        <w:t xml:space="preserve">Рисунок 2 Код Car первой части</w:t>
       </w:r>
     </w:p>
     <w:p>
@@ -1502,7 +1378,7 @@
         <w:rPr>
           <w:color w:val="000000"/>
         </w:rPr>
-        <w:t>Задача 2.3</w:t>
+        <w:t>Задача 2.2</w:t>
       </w:r>
     </w:p>
     <w:p>
@@ -1519,7 +1395,7 @@
           <w:sz w:val="24"/>
           <w:color w:val="000000"/>
         </w:rPr>
-        <w:t xml:space="preserve">Часть 2 Задача 1</w:t>
+        <w:t xml:space="preserve">Часть 1 Задача 2</w:t>
       </w:r>
     </w:p>
     <w:p>
@@ -1549,7 +1425,7 @@
           <w:sz w:val="24"/>
           <w:color w:val="000000"/>
         </w:rPr>
-        <w:t xml:space="preserve">Ваша программа должна быть организована по пакетам: пакет vehicles для классов Vehicle, Car, ElectricCar; пакет app для тестового класса TestCar. Используя программу, выполненную ранее, внести следующие изменения:</w:t>
+        <w:t xml:space="preserve">Создайте новый класс ElectricCar, который наследует класс Car, и добавьте в него поле batteryCapacity. В классе ElectricCar используйте поле engineType, чтобы задать тип двигателя как "Electric". Проверьте работу инкапсуляции и наследования, создав объекты классов Car и ElectricCar и продемонстрируйте доступ к полям с разными модификаторами.</w:t>
       </w:r>
     </w:p>
     <w:p>
@@ -1566,7 +1442,20 @@
           <w:sz w:val="24"/>
           <w:color w:val="000000"/>
         </w:rPr>
-        <w:t xml:space="preserve">1. Добавить абстрактный класс Vehicle, который будет представлять общие свойства всех транспортных средств. В этот класс включите следующие общие поля для транспортных средств: model (модель); license (номерной знак); color (цвет); year (год выпуска); ownerName (имя владельца); insuranceNumber (страховой номер); engineType (тип двигателя, поле должно быть защищённым для наследования). Определите абстрактный метод vehicleType(), который будет возвращать тип транспортного средства. Добавьте методы для получения и изменения значений полей (геттеры и сеттеры).</w:t>
+        <w:t xml:space="preserve">Цель работы — научиться наследовать класс и использовать защищённое поле в наследнике.</w:t>
+      </w:r>
+    </w:p>
+    <w:p>
+      <w:pPr>
+        <w:pStyle w:val="2"/>
+        <w:ind w:firstLine="709"/>
+        <w:jc w:val="left"/>
+      </w:pPr>
+      <w:r>
+        <w:rPr>
+          <w:color w:val="000000"/>
+        </w:rPr>
+        <w:t>Ход работы</w:t>
       </w:r>
     </w:p>
     <w:p>
@@ -1583,7 +1472,7 @@
           <w:sz w:val="24"/>
           <w:color w:val="000000"/>
         </w:rPr>
-        <w:t xml:space="preserve">Изменить класс Car, чтобы он наследовал Vehicle. Реализуйте абстрактный метод vehicleType(), чтобы он возвращал "Car". В конструкторе класса Car используйте поля и методы родительского класса.</w:t>
+        <w:t xml:space="preserve">ElectricCar наследует Car с помощью extends. В конструкторе super вызывает конструктор Car, после чего engineType получает значение Electric. Поле batteryCapacity объявлено private и имеет геттер и сеттер.</w:t>
       </w:r>
     </w:p>
     <w:p>
@@ -1600,15 +1489,15 @@
           <w:sz w:val="24"/>
           <w:color w:val="000000"/>
         </w:rPr>
-        <w:t xml:space="preserve">Изменить класс ElectricCar, чтобы он наследовал Car. Добавьте в класс поле batteryCapacity (емкость аккумулятора) и методы для работы с ним. Реализуйте метод vehicleType(), который будет возвращать "Electric Car". Используйте protected-поле engineType для установки значения "Electric" в классе ElectricCar.</w:t>
-      </w:r>
-    </w:p>
-    <w:p>
-      <w:pPr>
-        <w:pStyle w:val="a"/>
-        <w:ind w:firstLine="709"/>
-        <w:widowControl/>
-        <w:jc w:val="both"/>
+        <w:t xml:space="preserve">В Main создан электромобиль. Через методы изменены владелец, страховка и ёмкость аккумулятора. Поля владельца и страховки используются через унаследованные методы Car.</w:t>
+      </w:r>
+    </w:p>
+    <w:p>
+      <w:pPr>
+        <w:pStyle w:val="a"/>
+        <w:keepNext/>
+        <w:widowControl/>
+        <w:jc w:val="center"/>
         <w:spacing w:before="0" w:after="160" w:line="259" w:lineRule="auto"/>
       </w:pPr>
       <w:r>
@@ -1617,307 +1506,15 @@
           <w:sz w:val="24"/>
           <w:color w:val="000000"/>
         </w:rPr>
-        <w:t xml:space="preserve">Использовать полиморфизм в тестовом классе для работы с объектами Car и ElectricCar через ссылки на родительские классы. Создайте объекты Car и ElectricCar, измените их свойства с помощью сеттеров, и выведите информацию на экран с помощью метода toString().</w:t>
-      </w:r>
-    </w:p>
-    <w:p>
-      <w:pPr>
-        <w:pStyle w:val="a"/>
-        <w:ind w:firstLine="709"/>
-        <w:widowControl/>
-        <w:jc w:val="both"/>
-        <w:spacing w:before="0" w:after="160" w:line="259" w:lineRule="auto"/>
-      </w:pPr>
-      <w:r>
-        <w:rPr>
-          <w:rFonts w:ascii="Times New Roman" w:hAnsi="Times New Roman" w:cs="Times New Roman"/>
-          <w:sz w:val="24"/>
-          <w:color w:val="000000"/>
-        </w:rPr>
-        <w:t xml:space="preserve">Включить инкапсуляцию: убедитесь, что поля каждого класса имеют доступ через методы (геттеры и сеттеры), а не напрямую.</w:t>
-      </w:r>
-    </w:p>
-    <w:p>
-      <w:pPr>
-        <w:pStyle w:val="a"/>
-        <w:ind w:firstLine="709"/>
-        <w:widowControl/>
-        <w:jc w:val="both"/>
-        <w:spacing w:before="0" w:after="160" w:line="259" w:lineRule="auto"/>
-      </w:pPr>
-      <w:r>
-        <w:rPr>
-          <w:rFonts w:ascii="Times New Roman" w:hAnsi="Times New Roman" w:cs="Times New Roman"/>
-          <w:sz w:val="24"/>
-          <w:color w:val="000000"/>
-        </w:rPr>
-        <w:t xml:space="preserve">Цель работы — научиться использовать абстрактный класс, наследование, полиморфизм и toString.</w:t>
-      </w:r>
-    </w:p>
-    <w:p>
-      <w:pPr>
-        <w:pStyle w:val="2"/>
-        <w:ind w:firstLine="709"/>
-        <w:pageBreakBefore/>
-        <w:jc w:val="left"/>
-      </w:pPr>
-      <w:r>
-        <w:rPr>
-          <w:color w:val="000000"/>
-        </w:rPr>
-        <w:t>Ход работы</w:t>
-      </w:r>
-    </w:p>
-    <w:p>
-      <w:pPr>
-        <w:pStyle w:val="a"/>
-        <w:ind w:firstLine="709"/>
-        <w:widowControl/>
-        <w:jc w:val="both"/>
-        <w:spacing w:before="0" w:after="160" w:line="259" w:lineRule="auto"/>
-      </w:pPr>
-      <w:r>
-        <w:rPr>
-          <w:rFonts w:ascii="Times New Roman" w:hAnsi="Times New Roman" w:cs="Times New Roman"/>
-          <w:sz w:val="24"/>
-          <w:color w:val="000000"/>
-        </w:rPr>
-        <w:t xml:space="preserve">Этап 1 Создание класса Vehicle</w:t>
-      </w:r>
-    </w:p>
-    <w:p>
-      <w:pPr>
-        <w:pStyle w:val="a"/>
-        <w:ind w:firstLine="709"/>
-        <w:widowControl/>
-        <w:jc w:val="both"/>
-        <w:spacing w:before="0" w:after="160" w:line="259" w:lineRule="auto"/>
-      </w:pPr>
-      <w:r>
-        <w:rPr>
-          <w:rFonts w:ascii="Times New Roman" w:hAnsi="Times New Roman" w:cs="Times New Roman"/>
-          <w:sz w:val="24"/>
-          <w:color w:val="000000"/>
-        </w:rPr>
-        <w:t xml:space="preserve">Общие поля перенесены в абстрактный Vehicle. Все поля, кроме engineType, закрыты. engineType имеет модификатор protected. Для каждого поля добавлены обычные многострочные геттеры и сеттеры. Метод vehicleType объявлен без тела.</w:t>
-      </w:r>
-    </w:p>
-    <w:p>
-      <w:pPr>
-        <w:pStyle w:val="a"/>
-        <w:widowControl/>
-        <w:jc w:val="left"/>
-        <w:spacing w:before="0" w:after="0" w:line="240" w:lineRule="exact"/>
-      </w:pPr>
-      <w:r>
-        <w:rPr>
-          <w:rFonts w:ascii="Consolas" w:hAnsi="Consolas" w:cs="Times New Roman"/>
-          <w:sz w:val="22"/>
-          <w:color w:val="000000"/>
-        </w:rPr>
-        <w:t xml:space="preserve">public abstract class Vehicle {</w:t>
-      </w:r>
-    </w:p>
-    <w:p>
-      <w:pPr>
-        <w:pStyle w:val="a"/>
-        <w:widowControl/>
-        <w:jc w:val="left"/>
-        <w:spacing w:before="0" w:after="0" w:line="240" w:lineRule="exact"/>
-      </w:pPr>
-      <w:r>
-        <w:rPr>
-          <w:rFonts w:ascii="Consolas" w:hAnsi="Consolas" w:cs="Times New Roman"/>
-          <w:sz w:val="22"/>
-          <w:color w:val="000000"/>
-        </w:rPr>
-        <w:t xml:space="preserve">    private String model;</w:t>
-      </w:r>
-    </w:p>
-    <w:p>
-      <w:pPr>
-        <w:pStyle w:val="a"/>
-        <w:widowControl/>
-        <w:jc w:val="left"/>
-        <w:spacing w:before="0" w:after="0" w:line="240" w:lineRule="exact"/>
-      </w:pPr>
-      <w:r>
-        <w:rPr>
-          <w:rFonts w:ascii="Consolas" w:hAnsi="Consolas" w:cs="Times New Roman"/>
-          <w:sz w:val="22"/>
-          <w:color w:val="000000"/>
-        </w:rPr>
-        <w:t xml:space="preserve">    private String license;</w:t>
-      </w:r>
-    </w:p>
-    <w:p>
-      <w:pPr>
-        <w:pStyle w:val="a"/>
-        <w:widowControl/>
-        <w:jc w:val="left"/>
-        <w:spacing w:before="0" w:after="0" w:line="240" w:lineRule="exact"/>
-      </w:pPr>
-      <w:r>
-        <w:rPr>
-          <w:rFonts w:ascii="Consolas" w:hAnsi="Consolas" w:cs="Times New Roman"/>
-          <w:sz w:val="22"/>
-          <w:color w:val="000000"/>
-        </w:rPr>
-        <w:t xml:space="preserve">    private String color;</w:t>
-      </w:r>
-    </w:p>
-    <w:p>
-      <w:pPr>
-        <w:pStyle w:val="a"/>
-        <w:widowControl/>
-        <w:jc w:val="left"/>
-        <w:spacing w:before="0" w:after="0" w:line="240" w:lineRule="exact"/>
-      </w:pPr>
-      <w:r>
-        <w:rPr>
-          <w:rFonts w:ascii="Consolas" w:hAnsi="Consolas" w:cs="Times New Roman"/>
-          <w:sz w:val="22"/>
-          <w:color w:val="000000"/>
-        </w:rPr>
-        <w:t xml:space="preserve">    private int year;</w:t>
-      </w:r>
-    </w:p>
-    <w:p>
-      <w:pPr>
-        <w:pStyle w:val="a"/>
-        <w:widowControl/>
-        <w:jc w:val="left"/>
-        <w:spacing w:before="0" w:after="0" w:line="240" w:lineRule="exact"/>
-      </w:pPr>
-      <w:r>
-        <w:rPr>
-          <w:rFonts w:ascii="Consolas" w:hAnsi="Consolas" w:cs="Times New Roman"/>
-          <w:sz w:val="22"/>
-          <w:color w:val="000000"/>
-        </w:rPr>
-        <w:t xml:space="preserve">    private String ownerName;</w:t>
-      </w:r>
-    </w:p>
-    <w:p>
-      <w:pPr>
-        <w:pStyle w:val="a"/>
-        <w:widowControl/>
-        <w:jc w:val="left"/>
-        <w:spacing w:before="0" w:after="0" w:line="240" w:lineRule="exact"/>
-      </w:pPr>
-      <w:r>
-        <w:rPr>
-          <w:rFonts w:ascii="Consolas" w:hAnsi="Consolas" w:cs="Times New Roman"/>
-          <w:sz w:val="22"/>
-          <w:color w:val="000000"/>
-        </w:rPr>
-        <w:t xml:space="preserve">    private String insuranceNumber;</w:t>
-      </w:r>
-    </w:p>
-    <w:p>
-      <w:pPr>
-        <w:pStyle w:val="a"/>
-        <w:widowControl/>
-        <w:jc w:val="left"/>
-        <w:spacing w:before="0" w:after="0" w:line="240" w:lineRule="exact"/>
-      </w:pPr>
-      <w:r>
-        <w:rPr>
-          <w:rFonts w:ascii="Consolas" w:hAnsi="Consolas" w:cs="Times New Roman"/>
-          <w:sz w:val="22"/>
-          <w:color w:val="000000"/>
-        </w:rPr>
-        <w:t xml:space="preserve">    protected String engineType;</w:t>
-      </w:r>
-    </w:p>
-    <w:p>
-      <w:pPr>
-        <w:pStyle w:val="a"/>
-        <w:widowControl/>
-        <w:jc w:val="left"/>
-        <w:spacing w:before="0" w:after="0" w:line="240" w:lineRule="exact"/>
-      </w:pPr>
-      <w:r>
-        <w:rPr>
-          <w:rFonts w:ascii="Consolas" w:hAnsi="Consolas" w:cs="Times New Roman"/>
-          <w:sz w:val="22"/>
-          <w:color w:val="000000"/>
-        </w:rPr>
-        <w:t xml:space="preserve"/>
-      </w:r>
-    </w:p>
-    <w:p>
-      <w:pPr>
-        <w:pStyle w:val="a"/>
-        <w:widowControl/>
-        <w:jc w:val="left"/>
-        <w:spacing w:before="0" w:after="0" w:line="240" w:lineRule="exact"/>
-      </w:pPr>
-      <w:r>
-        <w:rPr>
-          <w:rFonts w:ascii="Consolas" w:hAnsi="Consolas" w:cs="Times New Roman"/>
-          <w:sz w:val="22"/>
-          <w:color w:val="000000"/>
-        </w:rPr>
-        <w:t xml:space="preserve">    public abstract String vehicleType();</w:t>
-      </w:r>
-    </w:p>
-    <w:p>
-      <w:pPr>
-        <w:pStyle w:val="a"/>
-        <w:widowControl/>
-        <w:jc w:val="left"/>
-        <w:spacing w:before="0" w:after="0" w:line="240" w:lineRule="exact"/>
-      </w:pPr>
-      <w:r>
-        <w:rPr>
-          <w:rFonts w:ascii="Consolas" w:hAnsi="Consolas" w:cs="Times New Roman"/>
-          <w:sz w:val="22"/>
-          <w:color w:val="000000"/>
-        </w:rPr>
-        <w:t xml:space="preserve">}</w:t>
-      </w:r>
-    </w:p>
-    <w:p>
-      <w:pPr>
-        <w:pStyle w:val="a"/>
-        <w:ind w:firstLine="709"/>
-        <w:widowControl/>
-        <w:jc w:val="both"/>
-        <w:spacing w:before="0" w:after="160" w:line="259" w:lineRule="auto"/>
-      </w:pPr>
-      <w:r>
-        <w:rPr>
-          <w:rFonts w:ascii="Times New Roman" w:hAnsi="Times New Roman" w:cs="Times New Roman"/>
-          <w:sz w:val="24"/>
-          <w:color w:val="000000"/>
-        </w:rPr>
-        <w:t xml:space="preserve">В toString общие свойства соединяются в строку. На скриншоте показаны исходный Vehicle.java и результат запуска TestCar с наследниками этого класса.</w:t>
-      </w:r>
-    </w:p>
-    <w:p>
-      <w:pPr>
-        <w:pStyle w:val="a"/>
-        <w:keepNext/>
-        <w:widowControl/>
-        <w:jc w:val="center"/>
-        <w:spacing w:before="0" w:after="160" w:line="259" w:lineRule="auto"/>
-      </w:pPr>
-      <w:r>
-        <w:rPr>
-          <w:rFonts w:ascii="Times New Roman" w:hAnsi="Times New Roman" w:cs="Times New Roman"/>
-          <w:sz w:val="24"/>
-          <w:color w:val="000000"/>
-        </w:rPr>
         <w:drawing>
           <wp:inline distT="0" distB="0" distL="0" distR="0">
-            <wp:extent cx="5905500" cy="4171521"/>
-            <wp:docPr id="103" name="Рисунок 3 Скриншот проверки класса Vehicle"/>
+            <wp:extent cx="5903999" cy="4177357"/>
+            <wp:docPr id="103" name="Рисунок 3 Код ElectricCar первой части"/>
             <ns4:graphic xmlns:ns4="http://schemas.openxmlformats.org/drawingml/2006/main">
               <ns4:graphicData uri="http://schemas.openxmlformats.org/drawingml/2006/picture">
                 <ns5:pic xmlns:ns5="http://schemas.openxmlformats.org/drawingml/2006/picture">
                   <ns5:nvPicPr>
-                    <ns5:cNvPr id="103" name="stage3.png"/>
+                    <ns5:cNvPr id="103" name="electric-car-code.png"/>
                     <ns5:cNvPicPr/>
                   </ns5:nvPicPr>
                   <ns5:blipFill>
@@ -1929,7 +1526,7 @@
                   <ns5:spPr>
                     <ns4:xfrm>
                       <ns4:off x="0" y="0"/>
-                      <ns4:ext cx="5905500" cy="4171521"/>
+                      <ns4:ext cx="5903999" cy="4177357"/>
                     </ns4:xfrm>
                     <ns4:prstGeom prst="rect">
                       <ns4:avLst/>
@@ -1955,7 +1552,20 @@
           <w:sz w:val="20"/>
           <w:color w:val="000000"/>
         </w:rPr>
-        <w:t xml:space="preserve">Рисунок 3 Скриншот проверки класса Vehicle</w:t>
+        <w:t xml:space="preserve">Рисунок 3 Код ElectricCar первой части</w:t>
+      </w:r>
+    </w:p>
+    <w:p>
+      <w:pPr>
+        <w:pStyle w:val="2"/>
+        <w:ind w:firstLine="709"/>
+        <w:jc w:val="left"/>
+      </w:pPr>
+      <w:r>
+        <w:rPr>
+          <w:color w:val="000000"/>
+        </w:rPr>
+        <w:t>Результаты и выводы</w:t>
       </w:r>
     </w:p>
     <w:p>
@@ -1972,7 +1582,7 @@
           <w:sz w:val="24"/>
           <w:color w:val="000000"/>
         </w:rPr>
-        <w:t xml:space="preserve">Прямое создание объекта Vehicle запрещено, потому что класс абстрактный. Полный код находится в part2/src/vehicles/Vehicle.java.</w:t>
+        <w:t xml:space="preserve">Вывод показывает владельца Мария, страховку 444, двигатель Electric и аккумулятор 75.0 кВт·ч. Научился наследовать методы и обращаться к protected-полю внутри наследника.</w:t>
       </w:r>
     </w:p>
     <w:p>
@@ -1986,7 +1596,7 @@
         <w:rPr>
           <w:color w:val="000000"/>
         </w:rPr>
-        <w:t>Ход работы</w:t>
+        <w:t>Проверка первой части в Main</w:t>
       </w:r>
     </w:p>
     <w:p>
@@ -2003,15 +1613,15 @@
           <w:sz w:val="24"/>
           <w:color w:val="000000"/>
         </w:rPr>
-        <w:t xml:space="preserve">Этап 2 Изменение классов Car и ElectricCar</w:t>
-      </w:r>
-    </w:p>
-    <w:p>
-      <w:pPr>
-        <w:pStyle w:val="a"/>
-        <w:ind w:firstLine="709"/>
-        <w:widowControl/>
-        <w:jc w:val="both"/>
+        <w:t xml:space="preserve">Main создаёт Car и ElectricCar, меняет свойства через сеттеры и получает значения геттерами. Прямой доступ к закрытым полям из пакета app запрещён.</w:t>
+      </w:r>
+    </w:p>
+    <w:p>
+      <w:pPr>
+        <w:pStyle w:val="a"/>
+        <w:keepNext/>
+        <w:widowControl/>
+        <w:jc w:val="center"/>
         <w:spacing w:before="0" w:after="160" w:line="259" w:lineRule="auto"/>
       </w:pPr>
       <w:r>
@@ -2020,145 +1630,15 @@
           <w:sz w:val="24"/>
           <w:color w:val="000000"/>
         </w:rPr>
-        <w:t xml:space="preserve">Car теперь наследует Vehicle. В конструкторе Car значения общих полей задаются через сеттеры родительского класса. Метод vehicleType возвращает Car.</w:t>
-      </w:r>
-    </w:p>
-    <w:p>
-      <w:pPr>
-        <w:pStyle w:val="a"/>
-        <w:widowControl/>
-        <w:jc w:val="left"/>
-        <w:spacing w:before="0" w:after="0" w:line="240" w:lineRule="exact"/>
-      </w:pPr>
-      <w:r>
-        <w:rPr>
-          <w:rFonts w:ascii="Consolas" w:hAnsi="Consolas" w:cs="Times New Roman"/>
-          <w:sz w:val="22"/>
-          <w:color w:val="000000"/>
-        </w:rPr>
-        <w:t xml:space="preserve">public String vehicleType() {</w:t>
-      </w:r>
-    </w:p>
-    <w:p>
-      <w:pPr>
-        <w:pStyle w:val="a"/>
-        <w:widowControl/>
-        <w:jc w:val="left"/>
-        <w:spacing w:before="0" w:after="0" w:line="240" w:lineRule="exact"/>
-      </w:pPr>
-      <w:r>
-        <w:rPr>
-          <w:rFonts w:ascii="Consolas" w:hAnsi="Consolas" w:cs="Times New Roman"/>
-          <w:sz w:val="22"/>
-          <w:color w:val="000000"/>
-        </w:rPr>
-        <w:t xml:space="preserve">    return "Car";</w:t>
-      </w:r>
-    </w:p>
-    <w:p>
-      <w:pPr>
-        <w:pStyle w:val="a"/>
-        <w:widowControl/>
-        <w:jc w:val="left"/>
-        <w:spacing w:before="0" w:after="0" w:line="240" w:lineRule="exact"/>
-      </w:pPr>
-      <w:r>
-        <w:rPr>
-          <w:rFonts w:ascii="Consolas" w:hAnsi="Consolas" w:cs="Times New Roman"/>
-          <w:sz w:val="22"/>
-          <w:color w:val="000000"/>
-        </w:rPr>
-        <w:t xml:space="preserve">}</w:t>
-      </w:r>
-    </w:p>
-    <w:p>
-      <w:pPr>
-        <w:pStyle w:val="a"/>
-        <w:ind w:firstLine="709"/>
-        <w:widowControl/>
-        <w:jc w:val="both"/>
-        <w:spacing w:before="0" w:after="160" w:line="259" w:lineRule="auto"/>
-      </w:pPr>
-      <w:r>
-        <w:rPr>
-          <w:rFonts w:ascii="Times New Roman" w:hAnsi="Times New Roman" w:cs="Times New Roman"/>
-          <w:sz w:val="24"/>
-          <w:color w:val="000000"/>
-        </w:rPr>
-        <w:t xml:space="preserve">ElectricCar наследует Car, добавляет batteryCapacity и задаёт engineType как Electric. Его vehicleType возвращает Electric Car, а toString дополняет описание аккумулятором.</w:t>
-      </w:r>
-    </w:p>
-    <w:p>
-      <w:pPr>
-        <w:pStyle w:val="a"/>
-        <w:widowControl/>
-        <w:jc w:val="left"/>
-        <w:spacing w:before="0" w:after="0" w:line="240" w:lineRule="exact"/>
-      </w:pPr>
-      <w:r>
-        <w:rPr>
-          <w:rFonts w:ascii="Consolas" w:hAnsi="Consolas" w:cs="Times New Roman"/>
-          <w:sz w:val="22"/>
-          <w:color w:val="000000"/>
-        </w:rPr>
-        <w:t xml:space="preserve">public String vehicleType() {</w:t>
-      </w:r>
-    </w:p>
-    <w:p>
-      <w:pPr>
-        <w:pStyle w:val="a"/>
-        <w:widowControl/>
-        <w:jc w:val="left"/>
-        <w:spacing w:before="0" w:after="0" w:line="240" w:lineRule="exact"/>
-      </w:pPr>
-      <w:r>
-        <w:rPr>
-          <w:rFonts w:ascii="Consolas" w:hAnsi="Consolas" w:cs="Times New Roman"/>
-          <w:sz w:val="22"/>
-          <w:color w:val="000000"/>
-        </w:rPr>
-        <w:t xml:space="preserve">    return "Electric Car";</w:t>
-      </w:r>
-    </w:p>
-    <w:p>
-      <w:pPr>
-        <w:pStyle w:val="a"/>
-        <w:widowControl/>
-        <w:jc w:val="left"/>
-        <w:spacing w:before="0" w:after="0" w:line="240" w:lineRule="exact"/>
-      </w:pPr>
-      <w:r>
-        <w:rPr>
-          <w:rFonts w:ascii="Consolas" w:hAnsi="Consolas" w:cs="Times New Roman"/>
-          <w:sz w:val="22"/>
-          <w:color w:val="000000"/>
-        </w:rPr>
-        <w:t xml:space="preserve">}</w:t>
-      </w:r>
-    </w:p>
-    <w:p>
-      <w:pPr>
-        <w:pStyle w:val="a"/>
-        <w:keepNext/>
-        <w:widowControl/>
-        <w:jc w:val="center"/>
-        <w:spacing w:before="0" w:after="160" w:line="259" w:lineRule="auto"/>
-      </w:pPr>
-      <w:r>
-        <w:rPr>
-          <w:rFonts w:ascii="Times New Roman" w:hAnsi="Times New Roman" w:cs="Times New Roman"/>
-          <w:sz w:val="24"/>
-          <w:color w:val="000000"/>
-        </w:rPr>
         <w:drawing>
           <wp:inline distT="0" distB="0" distL="0" distR="0">
-            <wp:extent cx="5905500" cy="4171521"/>
-            <wp:docPr id="104" name="Рисунок 4 Скриншот проверки наследования классов"/>
+            <wp:extent cx="5400000" cy="5476777"/>
+            <wp:docPr id="104" name="Рисунок 4 Код Main первой части"/>
             <ns6:graphic xmlns:ns6="http://schemas.openxmlformats.org/drawingml/2006/main">
               <ns6:graphicData uri="http://schemas.openxmlformats.org/drawingml/2006/picture">
                 <ns7:pic xmlns:ns7="http://schemas.openxmlformats.org/drawingml/2006/picture">
                   <ns7:nvPicPr>
-                    <ns7:cNvPr id="104" name="stage4.png"/>
+                    <ns7:cNvPr id="104" name="main-code.png"/>
                     <ns7:cNvPicPr/>
                   </ns7:nvPicPr>
                   <ns7:blipFill>
@@ -2170,7 +1650,7 @@
                   <ns7:spPr>
                     <ns6:xfrm>
                       <ns6:off x="0" y="0"/>
-                      <ns6:ext cx="5905500" cy="4171521"/>
+                      <ns6:ext cx="5400000" cy="5476777"/>
                     </ns6:xfrm>
                     <ns6:prstGeom prst="rect">
                       <ns6:avLst/>
@@ -2196,15 +1676,15 @@
           <w:sz w:val="20"/>
           <w:color w:val="000000"/>
         </w:rPr>
-        <w:t xml:space="preserve">Рисунок 4 Скриншот проверки наследования классов</w:t>
-      </w:r>
-    </w:p>
-    <w:p>
-      <w:pPr>
-        <w:pStyle w:val="a"/>
-        <w:ind w:firstLine="709"/>
-        <w:widowControl/>
-        <w:jc w:val="both"/>
+        <w:t xml:space="preserve">Рисунок 4 Код Main первой части</w:t>
+      </w:r>
+    </w:p>
+    <w:p>
+      <w:pPr>
+        <w:pStyle w:val="a"/>
+        <w:keepNext/>
+        <w:widowControl/>
+        <w:jc w:val="center"/>
         <w:spacing w:before="0" w:after="160" w:line="259" w:lineRule="auto"/>
       </w:pPr>
       <w:r>
@@ -2213,164 +1693,20 @@
           <w:sz w:val="24"/>
           <w:color w:val="000000"/>
         </w:rPr>
-        <w:t xml:space="preserve">Методы с одинаковым именем дают разные результаты для автомобиля и электромобиля. Данные изменяются через сеттеры. Поле engineType используется напрямую только внутри наследника.</w:t>
-      </w:r>
-    </w:p>
-    <w:p>
-      <w:pPr>
-        <w:pStyle w:val="2"/>
-        <w:ind w:firstLine="709"/>
-        <w:pageBreakBefore/>
-        <w:jc w:val="left"/>
-      </w:pPr>
-      <w:r>
-        <w:rPr>
-          <w:color w:val="000000"/>
-        </w:rPr>
-        <w:t>Ход работы</w:t>
-      </w:r>
-    </w:p>
-    <w:p>
-      <w:pPr>
-        <w:pStyle w:val="a"/>
-        <w:ind w:firstLine="709"/>
-        <w:widowControl/>
-        <w:jc w:val="both"/>
-        <w:spacing w:before="0" w:after="160" w:line="259" w:lineRule="auto"/>
-      </w:pPr>
-      <w:r>
-        <w:rPr>
-          <w:rFonts w:ascii="Times New Roman" w:hAnsi="Times New Roman" w:cs="Times New Roman"/>
-          <w:sz w:val="24"/>
-          <w:color w:val="000000"/>
-        </w:rPr>
-        <w:t xml:space="preserve">Этап 3 Проверка в TestCar</w:t>
-      </w:r>
-    </w:p>
-    <w:p>
-      <w:pPr>
-        <w:pStyle w:val="a"/>
-        <w:ind w:firstLine="709"/>
-        <w:widowControl/>
-        <w:jc w:val="both"/>
-        <w:spacing w:before="0" w:after="160" w:line="259" w:lineRule="auto"/>
-      </w:pPr>
-      <w:r>
-        <w:rPr>
-          <w:rFonts w:ascii="Times New Roman" w:hAnsi="Times New Roman" w:cs="Times New Roman"/>
-          <w:sz w:val="24"/>
-          <w:color w:val="000000"/>
-        </w:rPr>
-        <w:t xml:space="preserve">В app/TestCar.java созданы объекты Car и ElectricCar. У обоих объектов изменены свойства с помощью сеттеров. Для вывода используются ссылки Vehicle и Car и метод toString.</w:t>
-      </w:r>
-    </w:p>
-    <w:p>
-      <w:pPr>
-        <w:pStyle w:val="a"/>
-        <w:widowControl/>
-        <w:jc w:val="left"/>
-        <w:spacing w:before="0" w:after="0" w:line="240" w:lineRule="exact"/>
-      </w:pPr>
-      <w:r>
-        <w:rPr>
-          <w:rFonts w:ascii="Consolas" w:hAnsi="Consolas" w:cs="Times New Roman"/>
-          <w:sz w:val="22"/>
-          <w:color w:val="000000"/>
-        </w:rPr>
-        <w:t xml:space="preserve">Vehicle electricVehicle = electricCar;</w:t>
-      </w:r>
-    </w:p>
-    <w:p>
-      <w:pPr>
-        <w:pStyle w:val="a"/>
-        <w:widowControl/>
-        <w:jc w:val="left"/>
-        <w:spacing w:before="0" w:after="0" w:line="240" w:lineRule="exact"/>
-      </w:pPr>
-      <w:r>
-        <w:rPr>
-          <w:rFonts w:ascii="Consolas" w:hAnsi="Consolas" w:cs="Times New Roman"/>
-          <w:sz w:val="22"/>
-          <w:color w:val="000000"/>
-        </w:rPr>
-        <w:t xml:space="preserve">Car electricAsCar = electricCar;</w:t>
-      </w:r>
-    </w:p>
-    <w:p>
-      <w:pPr>
-        <w:pStyle w:val="a"/>
-        <w:widowControl/>
-        <w:jc w:val="left"/>
-        <w:spacing w:before="0" w:after="0" w:line="240" w:lineRule="exact"/>
-      </w:pPr>
-      <w:r>
-        <w:rPr>
-          <w:rFonts w:ascii="Consolas" w:hAnsi="Consolas" w:cs="Times New Roman"/>
-          <w:sz w:val="22"/>
-          <w:color w:val="000000"/>
-        </w:rPr>
-        <w:t xml:space="preserve"/>
-      </w:r>
-    </w:p>
-    <w:p>
-      <w:pPr>
-        <w:pStyle w:val="a"/>
-        <w:widowControl/>
-        <w:jc w:val="left"/>
-        <w:spacing w:before="0" w:after="0" w:line="240" w:lineRule="exact"/>
-      </w:pPr>
-      <w:r>
-        <w:rPr>
-          <w:rFonts w:ascii="Consolas" w:hAnsi="Consolas" w:cs="Times New Roman"/>
-          <w:sz w:val="22"/>
-          <w:color w:val="000000"/>
-        </w:rPr>
-        <w:t xml:space="preserve">System.out.println(electricVehicle.toString());</w:t>
-      </w:r>
-    </w:p>
-    <w:p>
-      <w:pPr>
-        <w:pStyle w:val="a"/>
-        <w:widowControl/>
-        <w:jc w:val="left"/>
-        <w:spacing w:before="0" w:after="0" w:line="240" w:lineRule="exact"/>
-      </w:pPr>
-      <w:r>
-        <w:rPr>
-          <w:rFonts w:ascii="Consolas" w:hAnsi="Consolas" w:cs="Times New Roman"/>
-          <w:sz w:val="22"/>
-          <w:color w:val="000000"/>
-        </w:rPr>
-        <w:t xml:space="preserve">System.out.println(electricAsCar.vehicleType());</w:t>
-      </w:r>
-    </w:p>
-    <w:p>
-      <w:pPr>
-        <w:pStyle w:val="a"/>
-        <w:keepNext/>
-        <w:widowControl/>
-        <w:jc w:val="center"/>
-        <w:spacing w:before="0" w:after="160" w:line="259" w:lineRule="auto"/>
-      </w:pPr>
-      <w:r>
-        <w:rPr>
-          <w:rFonts w:ascii="Times New Roman" w:hAnsi="Times New Roman" w:cs="Times New Roman"/>
-          <w:sz w:val="24"/>
-          <w:color w:val="000000"/>
-        </w:rPr>
         <w:drawing>
           <wp:inline distT="0" distB="0" distL="0" distR="0">
-            <wp:extent cx="5905500" cy="4171521"/>
-            <wp:docPr id="105" name="Рисунок 5 Скриншот запуска TestCar"/>
+            <wp:extent cx="4680000" cy="1882598"/>
+            <wp:docPr id="105" name="Рисунок 5 Фрагмент терминала при запуске Main"/>
             <ns8:graphic xmlns:ns8="http://schemas.openxmlformats.org/drawingml/2006/main">
               <ns8:graphicData uri="http://schemas.openxmlformats.org/drawingml/2006/picture">
                 <ns9:pic xmlns:ns9="http://schemas.openxmlformats.org/drawingml/2006/picture">
                   <ns9:nvPicPr>
-                    <ns9:cNvPr id="105" name="stage5.png"/>
+                    <ns9:cNvPr id="105" name="terminal-run.png"/>
                     <ns9:cNvPicPr/>
                   </ns9:nvPicPr>
                   <ns9:blipFill>
                     <ns8:blip r:embed="rIdReport5"/>
+                    <ns8:srcRect l="0" t="0" r="72000" b="0"/>
                     <ns8:stretch>
                       <ns8:fillRect/>
                     </ns8:stretch>
@@ -2378,7 +1714,7 @@
                   <ns9:spPr>
                     <ns8:xfrm>
                       <ns8:off x="0" y="0"/>
-                      <ns8:ext cx="5905500" cy="4171521"/>
+                      <ns8:ext cx="4680000" cy="1882598"/>
                     </ns8:xfrm>
                     <ns8:prstGeom prst="rect">
                       <ns8:avLst/>
@@ -2404,7 +1740,38 @@
           <w:sz w:val="20"/>
           <w:color w:val="000000"/>
         </w:rPr>
-        <w:t xml:space="preserve">Рисунок 5 Скриншот запуска TestCar</w:t>
+        <w:t xml:space="preserve">Рисунок 5 Фрагмент терминала при запуске Main</w:t>
+      </w:r>
+    </w:p>
+    <w:p>
+      <w:pPr>
+        <w:pStyle w:val="1"/>
+        <w:ind w:firstLine="709"/>
+        <w:pageBreakBefore/>
+        <w:jc w:val="left"/>
+      </w:pPr>
+      <w:r>
+        <w:rPr>
+          <w:color w:val="000000"/>
+        </w:rPr>
+        <w:t>Задача 2.3</w:t>
+      </w:r>
+    </w:p>
+    <w:p>
+      <w:pPr>
+        <w:pStyle w:val="a"/>
+        <w:ind w:firstLine="709"/>
+        <w:widowControl/>
+        <w:jc w:val="both"/>
+        <w:spacing w:before="0" w:after="160" w:line="259" w:lineRule="auto"/>
+      </w:pPr>
+      <w:r>
+        <w:rPr>
+          <w:rFonts w:ascii="Times New Roman" w:hAnsi="Times New Roman" w:cs="Times New Roman"/>
+          <w:sz w:val="24"/>
+          <w:color w:val="000000"/>
+        </w:rPr>
+        <w:t xml:space="preserve">Часть 2 Задача 1</w:t>
       </w:r>
     </w:p>
     <w:p>
@@ -2417,7 +1784,7 @@
         <w:rPr>
           <w:color w:val="000000"/>
         </w:rPr>
-        <w:t>Результаты и выводы</w:t>
+        <w:t>Описание задачи, цель</w:t>
       </w:r>
     </w:p>
     <w:p>
@@ -2434,7 +1801,7 @@
           <w:sz w:val="24"/>
           <w:color w:val="000000"/>
         </w:rPr>
-        <w:t xml:space="preserve">Для обычного автомобиля выведены Lada Vesta, A456AA, Чёрный, 2021, Пётр, 222 и Diesel. Для электромобиля выведены Tesla Model 3, E123EE, Синий, 2023, Мария, 444, Electric и аккумулятор 75.0 кВт·ч. Через ссылку Car метод возвращает Electric Car.</w:t>
+        <w:t xml:space="preserve">Ваша программа должна быть организована по пакетам: пакет vehicles для классов Vehicle, Car, ElectricCar; пакет app для тестового класса TestCar. Используя программу, выполненную ранее, внести следующие изменения:</w:t>
       </w:r>
     </w:p>
     <w:p>
@@ -2451,7 +1818,790 @@
           <w:sz w:val="24"/>
           <w:color w:val="000000"/>
         </w:rPr>
-        <w:t xml:space="preserve">Научился выделять общие поля в абстрактный класс, создавать наследников, менять значения через методы и работать с объектами через родительские типы. Все три задачи выполнены.</w:t>
+        <w:t xml:space="preserve">1. Добавить абстрактный класс Vehicle, который будет представлять общие свойства всех транспортных средств. В этот класс включите следующие общие поля для транспортных средств: model (модель); license (номерной знак); color (цвет); year (год выпуска); ownerName (имя владельца); insuranceNumber (страховой номер); engineType (тип двигателя, поле должно быть защищённым для наследования). Определите абстрактный метод vehicleType(), который будет возвращать тип транспортного средства. Добавьте методы для получения и изменения значений полей (геттеры и сеттеры).</w:t>
+      </w:r>
+    </w:p>
+    <w:p>
+      <w:pPr>
+        <w:pStyle w:val="a"/>
+        <w:ind w:firstLine="709"/>
+        <w:widowControl/>
+        <w:jc w:val="both"/>
+        <w:spacing w:before="0" w:after="160" w:line="259" w:lineRule="auto"/>
+      </w:pPr>
+      <w:r>
+        <w:rPr>
+          <w:rFonts w:ascii="Times New Roman" w:hAnsi="Times New Roman" w:cs="Times New Roman"/>
+          <w:sz w:val="24"/>
+          <w:color w:val="000000"/>
+        </w:rPr>
+        <w:t xml:space="preserve">Изменить класс Car, чтобы он наследовал Vehicle. Реализуйте абстрактный метод vehicleType(), чтобы он возвращал "Car". В конструкторе класса Car используйте поля и методы родительского класса.</w:t>
+      </w:r>
+    </w:p>
+    <w:p>
+      <w:pPr>
+        <w:pStyle w:val="a"/>
+        <w:ind w:firstLine="709"/>
+        <w:widowControl/>
+        <w:jc w:val="both"/>
+        <w:spacing w:before="0" w:after="160" w:line="259" w:lineRule="auto"/>
+      </w:pPr>
+      <w:r>
+        <w:rPr>
+          <w:rFonts w:ascii="Times New Roman" w:hAnsi="Times New Roman" w:cs="Times New Roman"/>
+          <w:sz w:val="24"/>
+          <w:color w:val="000000"/>
+        </w:rPr>
+        <w:t xml:space="preserve">Изменить класс ElectricCar, чтобы он наследовал Car. Добавьте в класс поле batteryCapacity (емкость аккумулятора) и методы для работы с ним. Реализуйте метод vehicleType(), который будет возвращать "Electric Car". Используйте protected-поле engineType для установки значения "Electric" в классе ElectricCar.</w:t>
+      </w:r>
+    </w:p>
+    <w:p>
+      <w:pPr>
+        <w:pStyle w:val="a"/>
+        <w:ind w:firstLine="709"/>
+        <w:widowControl/>
+        <w:jc w:val="both"/>
+        <w:spacing w:before="0" w:after="160" w:line="259" w:lineRule="auto"/>
+      </w:pPr>
+      <w:r>
+        <w:rPr>
+          <w:rFonts w:ascii="Times New Roman" w:hAnsi="Times New Roman" w:cs="Times New Roman"/>
+          <w:sz w:val="24"/>
+          <w:color w:val="000000"/>
+        </w:rPr>
+        <w:t xml:space="preserve">Использовать полиморфизм в тестовом классе для работы с объектами Car и ElectricCar через ссылки на родительские классы. Создайте объекты Car и ElectricCar, измените их свойства с помощью сеттеров, и выведите информацию на экран с помощью метода toString().</w:t>
+      </w:r>
+    </w:p>
+    <w:p>
+      <w:pPr>
+        <w:pStyle w:val="a"/>
+        <w:ind w:firstLine="709"/>
+        <w:widowControl/>
+        <w:jc w:val="both"/>
+        <w:spacing w:before="0" w:after="160" w:line="259" w:lineRule="auto"/>
+      </w:pPr>
+      <w:r>
+        <w:rPr>
+          <w:rFonts w:ascii="Times New Roman" w:hAnsi="Times New Roman" w:cs="Times New Roman"/>
+          <w:sz w:val="24"/>
+          <w:color w:val="000000"/>
+        </w:rPr>
+        <w:t xml:space="preserve">Включить инкапсуляцию: убедитесь, что поля каждого класса имеют доступ через методы (геттеры и сеттеры), а не напрямую.</w:t>
+      </w:r>
+    </w:p>
+    <w:p>
+      <w:pPr>
+        <w:pStyle w:val="a"/>
+        <w:ind w:firstLine="709"/>
+        <w:widowControl/>
+        <w:jc w:val="both"/>
+        <w:spacing w:before="0" w:after="160" w:line="259" w:lineRule="auto"/>
+      </w:pPr>
+      <w:r>
+        <w:rPr>
+          <w:rFonts w:ascii="Times New Roman" w:hAnsi="Times New Roman" w:cs="Times New Roman"/>
+          <w:sz w:val="24"/>
+          <w:color w:val="000000"/>
+        </w:rPr>
+        <w:t xml:space="preserve">Цель работы — научиться использовать абстрактный класс, наследование, полиморфизм и toString.</w:t>
+      </w:r>
+    </w:p>
+    <w:p>
+      <w:pPr>
+        <w:pStyle w:val="2"/>
+        <w:ind w:firstLine="709"/>
+        <w:pageBreakBefore/>
+        <w:jc w:val="left"/>
+      </w:pPr>
+      <w:r>
+        <w:rPr>
+          <w:color w:val="000000"/>
+        </w:rPr>
+        <w:t>Ход работы</w:t>
+      </w:r>
+    </w:p>
+    <w:p>
+      <w:pPr>
+        <w:pStyle w:val="a"/>
+        <w:ind w:firstLine="709"/>
+        <w:widowControl/>
+        <w:jc w:val="both"/>
+        <w:spacing w:before="0" w:after="160" w:line="259" w:lineRule="auto"/>
+      </w:pPr>
+      <w:r>
+        <w:rPr>
+          <w:rFonts w:ascii="Times New Roman" w:hAnsi="Times New Roman" w:cs="Times New Roman"/>
+          <w:sz w:val="24"/>
+          <w:color w:val="000000"/>
+        </w:rPr>
+        <w:t xml:space="preserve">Этап 1 Создание класса Vehicle</w:t>
+      </w:r>
+    </w:p>
+    <w:p>
+      <w:pPr>
+        <w:pStyle w:val="a"/>
+        <w:ind w:firstLine="709"/>
+        <w:widowControl/>
+        <w:jc w:val="both"/>
+        <w:spacing w:before="0" w:after="160" w:line="259" w:lineRule="auto"/>
+      </w:pPr>
+      <w:r>
+        <w:rPr>
+          <w:rFonts w:ascii="Times New Roman" w:hAnsi="Times New Roman" w:cs="Times New Roman"/>
+          <w:sz w:val="24"/>
+          <w:color w:val="000000"/>
+        </w:rPr>
+        <w:t xml:space="preserve">Общие поля перенесены в абстрактный Vehicle. Все поля, кроме engineType, закрыты. Для каждого свойства добавлены геттер и сеттер. Абстрактный метод vehicleType объявлен без тела и реализуется наследниками.</w:t>
+      </w:r>
+    </w:p>
+    <w:p>
+      <w:pPr>
+        <w:pStyle w:val="a"/>
+        <w:keepNext/>
+        <w:widowControl/>
+        <w:jc w:val="center"/>
+        <w:spacing w:before="0" w:after="160" w:line="259" w:lineRule="auto"/>
+      </w:pPr>
+      <w:r>
+        <w:rPr>
+          <w:rFonts w:ascii="Times New Roman" w:hAnsi="Times New Roman" w:cs="Times New Roman"/>
+          <w:sz w:val="24"/>
+          <w:color w:val="000000"/>
+        </w:rPr>
+        <w:drawing>
+          <wp:inline distT="0" distB="0" distL="0" distR="0">
+            <wp:extent cx="5903999" cy="5352067"/>
+            <wp:docPr id="106" name="Рисунок 6 Начало класса Vehicle"/>
+            <ns10:graphic xmlns:ns10="http://schemas.openxmlformats.org/drawingml/2006/main">
+              <ns10:graphicData uri="http://schemas.openxmlformats.org/drawingml/2006/picture">
+                <ns11:pic xmlns:ns11="http://schemas.openxmlformats.org/drawingml/2006/picture">
+                  <ns11:nvPicPr>
+                    <ns11:cNvPr id="106" name="vehicle-code.png"/>
+                    <ns11:cNvPicPr/>
+                  </ns11:nvPicPr>
+                  <ns11:blipFill>
+                    <ns10:blip r:embed="rIdReport6"/>
+                    <ns10:srcRect l="0" t="0" r="0" b="50000"/>
+                    <ns10:stretch>
+                      <ns10:fillRect/>
+                    </ns10:stretch>
+                  </ns11:blipFill>
+                  <ns11:spPr>
+                    <ns10:xfrm>
+                      <ns10:off x="0" y="0"/>
+                      <ns10:ext cx="5903999" cy="5352067"/>
+                    </ns10:xfrm>
+                    <ns10:prstGeom prst="rect">
+                      <ns10:avLst/>
+                    </ns10:prstGeom>
+                  </ns11:spPr>
+                </ns11:pic>
+              </ns10:graphicData>
+            </ns10:graphic>
+          </wp:inline>
+        </w:drawing>
+      </w:r>
+    </w:p>
+    <w:p>
+      <w:pPr>
+        <w:pStyle w:val="a"/>
+        <w:widowControl/>
+        <w:jc w:val="center"/>
+        <w:spacing w:before="0" w:after="160" w:line="259" w:lineRule="auto"/>
+      </w:pPr>
+      <w:r>
+        <w:rPr>
+          <w:rFonts w:ascii="Times New Roman" w:hAnsi="Times New Roman" w:cs="Times New Roman"/>
+          <w:sz w:val="20"/>
+          <w:color w:val="000000"/>
+        </w:rPr>
+        <w:t xml:space="preserve">Рисунок 6 Начало класса Vehicle</w:t>
+      </w:r>
+    </w:p>
+    <w:p>
+      <w:pPr>
+        <w:pStyle w:val="2"/>
+        <w:ind w:firstLine="709"/>
+        <w:pageBreakBefore/>
+        <w:jc w:val="left"/>
+      </w:pPr>
+      <w:r>
+        <w:rPr>
+          <w:color w:val="000000"/>
+        </w:rPr>
+        <w:t>Продолжение класса Vehicle</w:t>
+      </w:r>
+    </w:p>
+    <w:p>
+      <w:pPr>
+        <w:pStyle w:val="a"/>
+        <w:ind w:firstLine="709"/>
+        <w:widowControl/>
+        <w:jc w:val="both"/>
+        <w:spacing w:before="0" w:after="160" w:line="259" w:lineRule="auto"/>
+      </w:pPr>
+      <w:r>
+        <w:rPr>
+          <w:rFonts w:ascii="Times New Roman" w:hAnsi="Times New Roman" w:cs="Times New Roman"/>
+          <w:sz w:val="24"/>
+          <w:color w:val="000000"/>
+        </w:rPr>
+        <w:t xml:space="preserve">Метод toString возвращает тип и свойства автомобиля одной строкой. Прямое создание объекта Vehicle запрещено, потому что класс абстрактный. Полный код без разрывов приведён в разделе «Код программы».</w:t>
+      </w:r>
+    </w:p>
+    <w:p>
+      <w:pPr>
+        <w:pStyle w:val="a"/>
+        <w:keepNext/>
+        <w:widowControl/>
+        <w:jc w:val="center"/>
+        <w:spacing w:before="0" w:after="160" w:line="259" w:lineRule="auto"/>
+      </w:pPr>
+      <w:r>
+        <w:rPr>
+          <w:rFonts w:ascii="Times New Roman" w:hAnsi="Times New Roman" w:cs="Times New Roman"/>
+          <w:sz w:val="24"/>
+          <w:color w:val="000000"/>
+        </w:rPr>
+        <w:drawing>
+          <wp:inline distT="0" distB="0" distL="0" distR="0">
+            <wp:extent cx="5903999" cy="5352067"/>
+            <wp:docPr id="107" name="Рисунок 7 Геттеры и сеттеры Vehicle"/>
+            <ns12:graphic xmlns:ns12="http://schemas.openxmlformats.org/drawingml/2006/main">
+              <ns12:graphicData uri="http://schemas.openxmlformats.org/drawingml/2006/picture">
+                <ns13:pic xmlns:ns13="http://schemas.openxmlformats.org/drawingml/2006/picture">
+                  <ns13:nvPicPr>
+                    <ns13:cNvPr id="107" name="vehicle-code.png"/>
+                    <ns13:cNvPicPr/>
+                  </ns13:nvPicPr>
+                  <ns13:blipFill>
+                    <ns12:blip r:embed="rIdReport7"/>
+                    <ns12:srcRect l="0" t="50000" r="0" b="0"/>
+                    <ns12:stretch>
+                      <ns12:fillRect/>
+                    </ns12:stretch>
+                  </ns13:blipFill>
+                  <ns13:spPr>
+                    <ns12:xfrm>
+                      <ns12:off x="0" y="0"/>
+                      <ns12:ext cx="5903999" cy="5352067"/>
+                    </ns12:xfrm>
+                    <ns12:prstGeom prst="rect">
+                      <ns12:avLst/>
+                    </ns12:prstGeom>
+                  </ns13:spPr>
+                </ns13:pic>
+              </ns12:graphicData>
+            </ns12:graphic>
+          </wp:inline>
+        </w:drawing>
+      </w:r>
+    </w:p>
+    <w:p>
+      <w:pPr>
+        <w:pStyle w:val="a"/>
+        <w:widowControl/>
+        <w:jc w:val="center"/>
+        <w:spacing w:before="0" w:after="160" w:line="259" w:lineRule="auto"/>
+      </w:pPr>
+      <w:r>
+        <w:rPr>
+          <w:rFonts w:ascii="Times New Roman" w:hAnsi="Times New Roman" w:cs="Times New Roman"/>
+          <w:sz w:val="20"/>
+          <w:color w:val="000000"/>
+        </w:rPr>
+        <w:t xml:space="preserve">Рисунок 7 Геттеры и сеттеры Vehicle</w:t>
+      </w:r>
+    </w:p>
+    <w:p>
+      <w:pPr>
+        <w:pStyle w:val="a"/>
+        <w:keepNext/>
+        <w:widowControl/>
+        <w:jc w:val="center"/>
+        <w:spacing w:before="0" w:after="160" w:line="259" w:lineRule="auto"/>
+      </w:pPr>
+      <w:r>
+        <w:rPr>
+          <w:rFonts w:ascii="Times New Roman" w:hAnsi="Times New Roman" w:cs="Times New Roman"/>
+          <w:sz w:val="24"/>
+          <w:color w:val="000000"/>
+        </w:rPr>
+        <w:drawing>
+          <wp:inline distT="0" distB="0" distL="0" distR="0">
+            <wp:extent cx="4680000" cy="1398967"/>
+            <wp:docPr id="108" name="Рисунок 8 Окончание метода toString"/>
+            <ns14:graphic xmlns:ns14="http://schemas.openxmlformats.org/drawingml/2006/main">
+              <ns14:graphicData uri="http://schemas.openxmlformats.org/drawingml/2006/picture">
+                <ns15:pic xmlns:ns15="http://schemas.openxmlformats.org/drawingml/2006/picture">
+                  <ns15:nvPicPr>
+                    <ns15:cNvPr id="108" name="vehicle-end-code.png"/>
+                    <ns15:cNvPicPr/>
+                  </ns15:nvPicPr>
+                  <ns15:blipFill>
+                    <ns14:blip r:embed="rIdReport8"/>
+                    <ns14:stretch>
+                      <ns14:fillRect/>
+                    </ns14:stretch>
+                  </ns15:blipFill>
+                  <ns15:spPr>
+                    <ns14:xfrm>
+                      <ns14:off x="0" y="0"/>
+                      <ns14:ext cx="4680000" cy="1398967"/>
+                    </ns14:xfrm>
+                    <ns14:prstGeom prst="rect">
+                      <ns14:avLst/>
+                    </ns14:prstGeom>
+                  </ns15:spPr>
+                </ns15:pic>
+              </ns14:graphicData>
+            </ns14:graphic>
+          </wp:inline>
+        </w:drawing>
+      </w:r>
+    </w:p>
+    <w:p>
+      <w:pPr>
+        <w:pStyle w:val="a"/>
+        <w:widowControl/>
+        <w:jc w:val="center"/>
+        <w:spacing w:before="0" w:after="160" w:line="259" w:lineRule="auto"/>
+      </w:pPr>
+      <w:r>
+        <w:rPr>
+          <w:rFonts w:ascii="Times New Roman" w:hAnsi="Times New Roman" w:cs="Times New Roman"/>
+          <w:sz w:val="20"/>
+          <w:color w:val="000000"/>
+        </w:rPr>
+        <w:t xml:space="preserve">Рисунок 8 Окончание метода toString</w:t>
+      </w:r>
+    </w:p>
+    <w:p>
+      <w:pPr>
+        <w:pStyle w:val="2"/>
+        <w:ind w:firstLine="709"/>
+        <w:pageBreakBefore/>
+        <w:jc w:val="left"/>
+      </w:pPr>
+      <w:r>
+        <w:rPr>
+          <w:color w:val="000000"/>
+        </w:rPr>
+        <w:t>Ход работы</w:t>
+      </w:r>
+    </w:p>
+    <w:p>
+      <w:pPr>
+        <w:pStyle w:val="a"/>
+        <w:ind w:firstLine="709"/>
+        <w:widowControl/>
+        <w:jc w:val="both"/>
+        <w:spacing w:before="0" w:after="160" w:line="259" w:lineRule="auto"/>
+      </w:pPr>
+      <w:r>
+        <w:rPr>
+          <w:rFonts w:ascii="Times New Roman" w:hAnsi="Times New Roman" w:cs="Times New Roman"/>
+          <w:sz w:val="24"/>
+          <w:color w:val="000000"/>
+        </w:rPr>
+        <w:t xml:space="preserve">Этап 2 Изменение классов Car и ElectricCar</w:t>
+      </w:r>
+    </w:p>
+    <w:p>
+      <w:pPr>
+        <w:pStyle w:val="a"/>
+        <w:ind w:firstLine="709"/>
+        <w:widowControl/>
+        <w:jc w:val="both"/>
+        <w:spacing w:before="0" w:after="160" w:line="259" w:lineRule="auto"/>
+      </w:pPr>
+      <w:r>
+        <w:rPr>
+          <w:rFonts w:ascii="Times New Roman" w:hAnsi="Times New Roman" w:cs="Times New Roman"/>
+          <w:sz w:val="24"/>
+          <w:color w:val="000000"/>
+        </w:rPr>
+        <w:t xml:space="preserve">Car наследует Vehicle и задаёт общие свойства через сеттеры родителя. Его vehicleType возвращает Car. ElectricCar наследует Car, добавляет batteryCapacity, устанавливает engineType в Electric и дополняет toString данными аккумулятора.</w:t>
+      </w:r>
+    </w:p>
+    <w:p>
+      <w:pPr>
+        <w:pStyle w:val="a"/>
+        <w:keepNext/>
+        <w:widowControl/>
+        <w:jc w:val="center"/>
+        <w:spacing w:before="0" w:after="160" w:line="259" w:lineRule="auto"/>
+      </w:pPr>
+      <w:r>
+        <w:rPr>
+          <w:rFonts w:ascii="Times New Roman" w:hAnsi="Times New Roman" w:cs="Times New Roman"/>
+          <w:sz w:val="24"/>
+          <w:color w:val="000000"/>
+        </w:rPr>
+        <w:drawing>
+          <wp:inline distT="0" distB="0" distL="0" distR="0">
+            <wp:extent cx="5040000" cy="2651919"/>
+            <wp:docPr id="109" name="Рисунок 9 Код Car второй части"/>
+            <ns16:graphic xmlns:ns16="http://schemas.openxmlformats.org/drawingml/2006/main">
+              <ns16:graphicData uri="http://schemas.openxmlformats.org/drawingml/2006/picture">
+                <ns17:pic xmlns:ns17="http://schemas.openxmlformats.org/drawingml/2006/picture">
+                  <ns17:nvPicPr>
+                    <ns17:cNvPr id="109" name="car-code.png"/>
+                    <ns17:cNvPicPr/>
+                  </ns17:nvPicPr>
+                  <ns17:blipFill>
+                    <ns16:blip r:embed="rIdReport9"/>
+                    <ns16:stretch>
+                      <ns16:fillRect/>
+                    </ns16:stretch>
+                  </ns17:blipFill>
+                  <ns17:spPr>
+                    <ns16:xfrm>
+                      <ns16:off x="0" y="0"/>
+                      <ns16:ext cx="5040000" cy="2651919"/>
+                    </ns16:xfrm>
+                    <ns16:prstGeom prst="rect">
+                      <ns16:avLst/>
+                    </ns16:prstGeom>
+                  </ns17:spPr>
+                </ns17:pic>
+              </ns16:graphicData>
+            </ns16:graphic>
+          </wp:inline>
+        </w:drawing>
+      </w:r>
+    </w:p>
+    <w:p>
+      <w:pPr>
+        <w:pStyle w:val="a"/>
+        <w:widowControl/>
+        <w:jc w:val="center"/>
+        <w:spacing w:before="0" w:after="160" w:line="259" w:lineRule="auto"/>
+      </w:pPr>
+      <w:r>
+        <w:rPr>
+          <w:rFonts w:ascii="Times New Roman" w:hAnsi="Times New Roman" w:cs="Times New Roman"/>
+          <w:sz w:val="20"/>
+          <w:color w:val="000000"/>
+        </w:rPr>
+        <w:t xml:space="preserve">Рисунок 9 Код Car второй части</w:t>
+      </w:r>
+    </w:p>
+    <w:p>
+      <w:pPr>
+        <w:pStyle w:val="a"/>
+        <w:keepNext/>
+        <w:widowControl/>
+        <w:jc w:val="center"/>
+        <w:spacing w:before="0" w:after="160" w:line="259" w:lineRule="auto"/>
+      </w:pPr>
+      <w:r>
+        <w:rPr>
+          <w:rFonts w:ascii="Times New Roman" w:hAnsi="Times New Roman" w:cs="Times New Roman"/>
+          <w:sz w:val="24"/>
+          <w:color w:val="000000"/>
+        </w:rPr>
+        <w:drawing>
+          <wp:inline distT="0" distB="0" distL="0" distR="0">
+            <wp:extent cx="4320000" cy="3937465"/>
+            <wp:docPr id="110" name="Рисунок 10 Код ElectricCar второй части"/>
+            <ns18:graphic xmlns:ns18="http://schemas.openxmlformats.org/drawingml/2006/main">
+              <ns18:graphicData uri="http://schemas.openxmlformats.org/drawingml/2006/picture">
+                <ns19:pic xmlns:ns19="http://schemas.openxmlformats.org/drawingml/2006/picture">
+                  <ns19:nvPicPr>
+                    <ns19:cNvPr id="110" name="electric-car-code.png"/>
+                    <ns19:cNvPicPr/>
+                  </ns19:nvPicPr>
+                  <ns19:blipFill>
+                    <ns18:blip r:embed="rIdReport10"/>
+                    <ns18:stretch>
+                      <ns18:fillRect/>
+                    </ns18:stretch>
+                  </ns19:blipFill>
+                  <ns19:spPr>
+                    <ns18:xfrm>
+                      <ns18:off x="0" y="0"/>
+                      <ns18:ext cx="4320000" cy="3937465"/>
+                    </ns18:xfrm>
+                    <ns18:prstGeom prst="rect">
+                      <ns18:avLst/>
+                    </ns18:prstGeom>
+                  </ns19:spPr>
+                </ns19:pic>
+              </ns18:graphicData>
+            </ns18:graphic>
+          </wp:inline>
+        </w:drawing>
+      </w:r>
+    </w:p>
+    <w:p>
+      <w:pPr>
+        <w:pStyle w:val="a"/>
+        <w:widowControl/>
+        <w:jc w:val="center"/>
+        <w:spacing w:before="0" w:after="160" w:line="259" w:lineRule="auto"/>
+      </w:pPr>
+      <w:r>
+        <w:rPr>
+          <w:rFonts w:ascii="Times New Roman" w:hAnsi="Times New Roman" w:cs="Times New Roman"/>
+          <w:sz w:val="20"/>
+          <w:color w:val="000000"/>
+        </w:rPr>
+        <w:t xml:space="preserve">Рисунок 10 Код ElectricCar второй части</w:t>
+      </w:r>
+    </w:p>
+    <w:p>
+      <w:pPr>
+        <w:pStyle w:val="2"/>
+        <w:ind w:firstLine="709"/>
+        <w:pageBreakBefore/>
+        <w:jc w:val="left"/>
+      </w:pPr>
+      <w:r>
+        <w:rPr>
+          <w:color w:val="000000"/>
+        </w:rPr>
+        <w:t>Ход работы</w:t>
+      </w:r>
+    </w:p>
+    <w:p>
+      <w:pPr>
+        <w:pStyle w:val="a"/>
+        <w:ind w:firstLine="709"/>
+        <w:widowControl/>
+        <w:jc w:val="both"/>
+        <w:spacing w:before="0" w:after="160" w:line="259" w:lineRule="auto"/>
+      </w:pPr>
+      <w:r>
+        <w:rPr>
+          <w:rFonts w:ascii="Times New Roman" w:hAnsi="Times New Roman" w:cs="Times New Roman"/>
+          <w:sz w:val="24"/>
+          <w:color w:val="000000"/>
+        </w:rPr>
+        <w:t xml:space="preserve">Этап 3 Проверка в TestCar</w:t>
+      </w:r>
+    </w:p>
+    <w:p>
+      <w:pPr>
+        <w:pStyle w:val="a"/>
+        <w:ind w:firstLine="709"/>
+        <w:widowControl/>
+        <w:jc w:val="both"/>
+        <w:spacing w:before="0" w:after="160" w:line="259" w:lineRule="auto"/>
+      </w:pPr>
+      <w:r>
+        <w:rPr>
+          <w:rFonts w:ascii="Times New Roman" w:hAnsi="Times New Roman" w:cs="Times New Roman"/>
+          <w:sz w:val="24"/>
+          <w:color w:val="000000"/>
+        </w:rPr>
+        <w:t xml:space="preserve">В app/TestCar.java созданы Car и ElectricCar. Их свойства изменены сеттерами. Для вывода используются ссылки Vehicle и Car: вызываются методы фактического объекта ElectricCar.</w:t>
+      </w:r>
+    </w:p>
+    <w:p>
+      <w:pPr>
+        <w:pStyle w:val="a"/>
+        <w:widowControl/>
+        <w:jc w:val="left"/>
+        <w:spacing w:before="0" w:after="0" w:line="240" w:lineRule="exact"/>
+      </w:pPr>
+      <w:r>
+        <w:rPr>
+          <w:rFonts w:ascii="Consolas" w:hAnsi="Consolas" w:cs="Times New Roman"/>
+          <w:sz w:val="22"/>
+          <w:color w:val="000000"/>
+        </w:rPr>
+        <w:t xml:space="preserve">Vehicle electricVehicle = electricCar;</w:t>
+      </w:r>
+    </w:p>
+    <w:p>
+      <w:pPr>
+        <w:pStyle w:val="a"/>
+        <w:widowControl/>
+        <w:jc w:val="left"/>
+        <w:spacing w:before="0" w:after="0" w:line="240" w:lineRule="exact"/>
+      </w:pPr>
+      <w:r>
+        <w:rPr>
+          <w:rFonts w:ascii="Consolas" w:hAnsi="Consolas" w:cs="Times New Roman"/>
+          <w:sz w:val="22"/>
+          <w:color w:val="000000"/>
+        </w:rPr>
+        <w:t xml:space="preserve">Car electricAsCar = electricCar;</w:t>
+      </w:r>
+    </w:p>
+    <w:p>
+      <w:pPr>
+        <w:pStyle w:val="a"/>
+        <w:keepNext/>
+        <w:widowControl/>
+        <w:jc w:val="center"/>
+        <w:spacing w:before="0" w:after="160" w:line="259" w:lineRule="auto"/>
+      </w:pPr>
+      <w:r>
+        <w:rPr>
+          <w:rFonts w:ascii="Times New Roman" w:hAnsi="Times New Roman" w:cs="Times New Roman"/>
+          <w:sz w:val="24"/>
+          <w:color w:val="000000"/>
+        </w:rPr>
+        <w:drawing>
+          <wp:inline distT="0" distB="0" distL="0" distR="0">
+            <wp:extent cx="5400000" cy="5180541"/>
+            <wp:docPr id="111" name="Рисунок 11 Код TestCar второй части"/>
+            <ns20:graphic xmlns:ns20="http://schemas.openxmlformats.org/drawingml/2006/main">
+              <ns20:graphicData uri="http://schemas.openxmlformats.org/drawingml/2006/picture">
+                <ns21:pic xmlns:ns21="http://schemas.openxmlformats.org/drawingml/2006/picture">
+                  <ns21:nvPicPr>
+                    <ns21:cNvPr id="111" name="testcar-code.png"/>
+                    <ns21:cNvPicPr/>
+                  </ns21:nvPicPr>
+                  <ns21:blipFill>
+                    <ns20:blip r:embed="rIdReport11"/>
+                    <ns20:stretch>
+                      <ns20:fillRect/>
+                    </ns20:stretch>
+                  </ns21:blipFill>
+                  <ns21:spPr>
+                    <ns20:xfrm>
+                      <ns20:off x="0" y="0"/>
+                      <ns20:ext cx="5400000" cy="5180541"/>
+                    </ns20:xfrm>
+                    <ns20:prstGeom prst="rect">
+                      <ns20:avLst/>
+                    </ns20:prstGeom>
+                  </ns21:spPr>
+                </ns21:pic>
+              </ns20:graphicData>
+            </ns20:graphic>
+          </wp:inline>
+        </w:drawing>
+      </w:r>
+    </w:p>
+    <w:p>
+      <w:pPr>
+        <w:pStyle w:val="a"/>
+        <w:widowControl/>
+        <w:jc w:val="center"/>
+        <w:spacing w:before="0" w:after="160" w:line="259" w:lineRule="auto"/>
+      </w:pPr>
+      <w:r>
+        <w:rPr>
+          <w:rFonts w:ascii="Times New Roman" w:hAnsi="Times New Roman" w:cs="Times New Roman"/>
+          <w:sz w:val="20"/>
+          <w:color w:val="000000"/>
+        </w:rPr>
+        <w:t xml:space="preserve">Рисунок 11 Код TestCar второй части</w:t>
+      </w:r>
+    </w:p>
+    <w:p>
+      <w:pPr>
+        <w:pStyle w:val="2"/>
+        <w:ind w:firstLine="709"/>
+        <w:pageBreakBefore/>
+        <w:jc w:val="left"/>
+      </w:pPr>
+      <w:r>
+        <w:rPr>
+          <w:color w:val="000000"/>
+        </w:rPr>
+        <w:t>Результаты и выводы</w:t>
+      </w:r>
+    </w:p>
+    <w:p>
+      <w:pPr>
+        <w:pStyle w:val="a"/>
+        <w:ind w:firstLine="709"/>
+        <w:widowControl/>
+        <w:jc w:val="both"/>
+        <w:spacing w:before="0" w:after="160" w:line="259" w:lineRule="auto"/>
+      </w:pPr>
+      <w:r>
+        <w:rPr>
+          <w:rFonts w:ascii="Times New Roman" w:hAnsi="Times New Roman" w:cs="Times New Roman"/>
+          <w:sz w:val="24"/>
+          <w:color w:val="000000"/>
+        </w:rPr>
+        <w:t xml:space="preserve">Для обычного автомобиля выведены Lada Vesta, A456AA, Чёрный, 2021, Пётр, 222 и Diesel. Для электромобиля выведены Tesla Model 3, E123EE, Синий, 2023, Мария, 444, Electric и аккумулятор 75.0 кВт·ч. Через ссылку Car метод возвращает Electric Car.</w:t>
+      </w:r>
+    </w:p>
+    <w:p>
+      <w:pPr>
+        <w:pStyle w:val="a"/>
+        <w:keepNext/>
+        <w:widowControl/>
+        <w:jc w:val="center"/>
+        <w:spacing w:before="0" w:after="160" w:line="259" w:lineRule="auto"/>
+      </w:pPr>
+      <w:r>
+        <w:rPr>
+          <w:rFonts w:ascii="Times New Roman" w:hAnsi="Times New Roman" w:cs="Times New Roman"/>
+          <w:sz w:val="24"/>
+          <w:color w:val="000000"/>
+        </w:rPr>
+        <w:drawing>
+          <wp:inline distT="0" distB="0" distL="0" distR="0">
+            <wp:extent cx="3960000" cy="2915395"/>
+            <wp:docPr id="112" name="Рисунок 12 Фрагмент вывода TestCar"/>
+            <ns22:graphic xmlns:ns22="http://schemas.openxmlformats.org/drawingml/2006/main">
+              <ns22:graphicData uri="http://schemas.openxmlformats.org/drawingml/2006/picture">
+                <ns23:pic xmlns:ns23="http://schemas.openxmlformats.org/drawingml/2006/picture">
+                  <ns23:nvPicPr>
+                    <ns23:cNvPr id="112" name="output.png"/>
+                    <ns23:cNvPicPr/>
+                  </ns23:nvPicPr>
+                  <ns23:blipFill>
+                    <ns22:blip r:embed="rIdReport12"/>
+                    <ns22:stretch>
+                      <ns22:fillRect/>
+                    </ns22:stretch>
+                  </ns23:blipFill>
+                  <ns23:spPr>
+                    <ns22:xfrm>
+                      <ns22:off x="0" y="0"/>
+                      <ns22:ext cx="3960000" cy="2915395"/>
+                    </ns22:xfrm>
+                    <ns22:prstGeom prst="rect">
+                      <ns22:avLst/>
+                    </ns22:prstGeom>
+                  </ns23:spPr>
+                </ns23:pic>
+              </ns22:graphicData>
+            </ns22:graphic>
+          </wp:inline>
+        </w:drawing>
+      </w:r>
+    </w:p>
+    <w:p>
+      <w:pPr>
+        <w:pStyle w:val="a"/>
+        <w:widowControl/>
+        <w:jc w:val="center"/>
+        <w:spacing w:before="0" w:after="160" w:line="259" w:lineRule="auto"/>
+      </w:pPr>
+      <w:r>
+        <w:rPr>
+          <w:rFonts w:ascii="Times New Roman" w:hAnsi="Times New Roman" w:cs="Times New Roman"/>
+          <w:sz w:val="20"/>
+          <w:color w:val="000000"/>
+        </w:rPr>
+        <w:t xml:space="preserve">Рисунок 12 Фрагмент вывода TestCar</w:t>
+      </w:r>
+    </w:p>
+    <w:p>
+      <w:pPr>
+        <w:pStyle w:val="a"/>
+        <w:ind w:firstLine="709"/>
+        <w:widowControl/>
+        <w:jc w:val="both"/>
+        <w:spacing w:before="0" w:after="160" w:line="259" w:lineRule="auto"/>
+      </w:pPr>
+      <w:r>
+        <w:rPr>
+          <w:rFonts w:ascii="Times New Roman" w:hAnsi="Times New Roman" w:cs="Times New Roman"/>
+          <w:sz w:val="24"/>
+          <w:color w:val="000000"/>
+        </w:rPr>
+        <w:t xml:space="preserve">Научился выделять общие поля в абстрактный класс, создавать наследников, менять значения через методы и работать с объектами через родительские типы. Все три задачи выполнены. Полный вывод обеих частей находится в конце отчёта.</w:t>
       </w:r>
     </w:p>
     <w:p>

</xml_diff>